<commit_message>
Add files & VC tips doc update
</commit_message>
<xml_diff>
--- a/VC tips.docx
+++ b/VC tips.docx
@@ -63,8 +63,8 @@
               <w14:ligatures w14:val="standardContextual"/>
             </w:rPr>
             <w:drawing>
-              <wp:inline distT="0" distB="0" distL="0" distR="0" wp14:anchorId="3392A951" wp14:editId="02CA51B8">
-                <wp:extent cx="2385267" cy="1173582"/>
+              <wp:inline distT="0" distB="0" distL="0" distR="0" wp14:anchorId="3392A951" wp14:editId="4C841949">
+                <wp:extent cx="1579715" cy="777240"/>
                 <wp:effectExtent l="0" t="0" r="0" b="0"/>
                 <wp:docPr id="1827252903" name="Picture 1" descr="A red and black logo&#10;&#10;AI-generated content may be incorrect."/>
                 <wp:cNvGraphicFramePr>
@@ -86,7 +86,61 @@
                       <pic:spPr>
                         <a:xfrm>
                           <a:off x="0" y="0"/>
-                          <a:ext cx="2385267" cy="1173582"/>
+                          <a:ext cx="1599601" cy="787024"/>
+                        </a:xfrm>
+                        <a:prstGeom prst="rect">
+                          <a:avLst/>
+                        </a:prstGeom>
+                      </pic:spPr>
+                    </pic:pic>
+                  </a:graphicData>
+                </a:graphic>
+              </wp:inline>
+            </w:drawing>
+          </w:r>
+        </w:p>
+        <w:p>
+          <w:pPr>
+            <w:pStyle w:val="TOCHeading"/>
+            <w:jc w:val="center"/>
+            <w:rPr>
+              <w:rFonts w:asciiTheme="minorHAnsi" w:eastAsiaTheme="minorHAnsi" w:hAnsiTheme="minorHAnsi" w:cstheme="minorBidi"/>
+              <w:color w:val="auto"/>
+              <w:kern w:val="2"/>
+              <w:sz w:val="24"/>
+              <w:szCs w:val="24"/>
+              <w14:ligatures w14:val="standardContextual"/>
+            </w:rPr>
+          </w:pPr>
+          <w:r>
+            <w:rPr>
+              <w:noProof/>
+            </w:rPr>
+            <w:drawing>
+              <wp:inline distT="0" distB="0" distL="0" distR="0" wp14:anchorId="2F383435" wp14:editId="4246484E">
+                <wp:extent cx="3218688" cy="1760220"/>
+                <wp:effectExtent l="0" t="0" r="1270" b="0"/>
+                <wp:docPr id="146673362" name="Picture 1" descr="A diagram of a structure"/>
+                <wp:cNvGraphicFramePr>
+                  <a:graphicFrameLocks xmlns:a="http://schemas.openxmlformats.org/drawingml/2006/main" noChangeAspect="1"/>
+                </wp:cNvGraphicFramePr>
+                <a:graphic xmlns:a="http://schemas.openxmlformats.org/drawingml/2006/main">
+                  <a:graphicData uri="http://schemas.openxmlformats.org/drawingml/2006/picture">
+                    <pic:pic xmlns:pic="http://schemas.openxmlformats.org/drawingml/2006/picture">
+                      <pic:nvPicPr>
+                        <pic:cNvPr id="146673362" name="Picture 1" descr="A diagram of a structure"/>
+                        <pic:cNvPicPr/>
+                      </pic:nvPicPr>
+                      <pic:blipFill>
+                        <a:blip r:embed="rId7"/>
+                        <a:stretch>
+                          <a:fillRect/>
+                        </a:stretch>
+                      </pic:blipFill>
+                      <pic:spPr>
+                        <a:xfrm>
+                          <a:off x="0" y="0"/>
+                          <a:ext cx="3232671" cy="1767867"/>
                         </a:xfrm>
                         <a:prstGeom prst="rect">
                           <a:avLst/>
@@ -135,13 +189,153 @@
           <w:r>
             <w:fldChar w:fldCharType="separate"/>
           </w:r>
-          <w:hyperlink w:anchor="_Toc200722436" w:history="1">
+          <w:hyperlink w:anchor="_Toc201820767" w:history="1">
             <w:r>
               <w:rPr>
                 <w:rStyle w:val="Hyperlink"/>
                 <w:noProof/>
                 <w:lang w:val="fr-FR"/>
               </w:rPr>
+              <w:t>Importation d’un projet dans le Workspace et premier commit vers le dépôt local</w:t>
+            </w:r>
+            <w:r>
+              <w:rPr>
+                <w:noProof/>
+                <w:webHidden/>
+              </w:rPr>
+              <w:tab/>
+            </w:r>
+            <w:r>
+              <w:rPr>
+                <w:noProof/>
+                <w:webHidden/>
+              </w:rPr>
+              <w:fldChar w:fldCharType="begin"/>
+            </w:r>
+            <w:r>
+              <w:rPr>
+                <w:noProof/>
+                <w:webHidden/>
+              </w:rPr>
+              <w:instrText xml:space="preserve"> PAGEREF _Toc201820767 \h </w:instrText>
+            </w:r>
+            <w:r>
+              <w:rPr>
+                <w:noProof/>
+                <w:webHidden/>
+              </w:rPr>
+            </w:r>
+            <w:r>
+              <w:rPr>
+                <w:noProof/>
+                <w:webHidden/>
+              </w:rPr>
+              <w:fldChar w:fldCharType="separate"/>
+            </w:r>
+            <w:r>
+              <w:rPr>
+                <w:noProof/>
+                <w:webHidden/>
+              </w:rPr>
+              <w:t>3</w:t>
+            </w:r>
+            <w:r>
+              <w:rPr>
+                <w:noProof/>
+                <w:webHidden/>
+              </w:rPr>
+              <w:fldChar w:fldCharType="end"/>
+            </w:r>
+          </w:hyperlink>
+        </w:p>
+        <w:p>
+          <w:pPr>
+            <w:pStyle w:val="TOC1"/>
+            <w:tabs>
+              <w:tab w:val="right" w:leader="dot" w:pos="9350"/>
+            </w:tabs>
+            <w:rPr>
+              <w:rFonts w:eastAsiaTheme="minorEastAsia"/>
+              <w:noProof/>
+            </w:rPr>
+          </w:pPr>
+          <w:hyperlink w:anchor="_Toc201820768" w:history="1">
+            <w:r>
+              <w:rPr>
+                <w:rStyle w:val="Hyperlink"/>
+                <w:noProof/>
+                <w:lang w:val="fr-FR"/>
+              </w:rPr>
+              <w:t>Lien vers le dépôt distant et premier push</w:t>
+            </w:r>
+            <w:r>
+              <w:rPr>
+                <w:noProof/>
+                <w:webHidden/>
+              </w:rPr>
+              <w:tab/>
+            </w:r>
+            <w:r>
+              <w:rPr>
+                <w:noProof/>
+                <w:webHidden/>
+              </w:rPr>
+              <w:fldChar w:fldCharType="begin"/>
+            </w:r>
+            <w:r>
+              <w:rPr>
+                <w:noProof/>
+                <w:webHidden/>
+              </w:rPr>
+              <w:instrText xml:space="preserve"> PAGEREF _Toc201820768 \h </w:instrText>
+            </w:r>
+            <w:r>
+              <w:rPr>
+                <w:noProof/>
+                <w:webHidden/>
+              </w:rPr>
+            </w:r>
+            <w:r>
+              <w:rPr>
+                <w:noProof/>
+                <w:webHidden/>
+              </w:rPr>
+              <w:fldChar w:fldCharType="separate"/>
+            </w:r>
+            <w:r>
+              <w:rPr>
+                <w:noProof/>
+                <w:webHidden/>
+              </w:rPr>
+              <w:t>4</w:t>
+            </w:r>
+            <w:r>
+              <w:rPr>
+                <w:noProof/>
+                <w:webHidden/>
+              </w:rPr>
+              <w:fldChar w:fldCharType="end"/>
+            </w:r>
+          </w:hyperlink>
+        </w:p>
+        <w:p>
+          <w:pPr>
+            <w:pStyle w:val="TOC1"/>
+            <w:tabs>
+              <w:tab w:val="right" w:leader="dot" w:pos="9350"/>
+            </w:tabs>
+            <w:rPr>
+              <w:rFonts w:eastAsiaTheme="minorEastAsia"/>
+              <w:noProof/>
+            </w:rPr>
+          </w:pPr>
+          <w:hyperlink w:anchor="_Toc201820769" w:history="1">
+            <w:r>
+              <w:rPr>
+                <w:rStyle w:val="Hyperlink"/>
+                <w:noProof/>
+                <w:lang w:val="fr-FR"/>
+              </w:rPr>
               <w:t>Les branches</w:t>
             </w:r>
             <w:r>
@@ -163,7 +357,7 @@
                 <w:noProof/>
                 <w:webHidden/>
               </w:rPr>
-              <w:instrText xml:space="preserve"> PAGEREF _Toc200722436 \h </w:instrText>
+              <w:instrText xml:space="preserve"> PAGEREF _Toc201820769 \h </w:instrText>
             </w:r>
             <w:r>
               <w:rPr>
@@ -183,7 +377,7 @@
                 <w:noProof/>
                 <w:webHidden/>
               </w:rPr>
-              <w:t>2</w:t>
+              <w:t>5</w:t>
             </w:r>
             <w:r>
               <w:rPr>
@@ -205,7 +399,7 @@
               <w:noProof/>
             </w:rPr>
           </w:pPr>
-          <w:hyperlink w:anchor="_Toc200722437" w:history="1">
+          <w:hyperlink w:anchor="_Toc201820770" w:history="1">
             <w:r>
               <w:rPr>
                 <w:rStyle w:val="Hyperlink"/>
@@ -233,7 +427,7 @@
                 <w:noProof/>
                 <w:webHidden/>
               </w:rPr>
-              <w:instrText xml:space="preserve"> PAGEREF _Toc200722437 \h </w:instrText>
+              <w:instrText xml:space="preserve"> PAGEREF _Toc201820770 \h </w:instrText>
             </w:r>
             <w:r>
               <w:rPr>
@@ -253,7 +447,7 @@
                 <w:noProof/>
                 <w:webHidden/>
               </w:rPr>
-              <w:t>2</w:t>
+              <w:t>5</w:t>
             </w:r>
             <w:r>
               <w:rPr>
@@ -275,7 +469,7 @@
               <w:noProof/>
             </w:rPr>
           </w:pPr>
-          <w:hyperlink w:anchor="_Toc200722438" w:history="1">
+          <w:hyperlink w:anchor="_Toc201820771" w:history="1">
             <w:r>
               <w:rPr>
                 <w:rStyle w:val="Hyperlink"/>
@@ -303,7 +497,7 @@
                 <w:noProof/>
                 <w:webHidden/>
               </w:rPr>
-              <w:instrText xml:space="preserve"> PAGEREF _Toc200722438 \h </w:instrText>
+              <w:instrText xml:space="preserve"> PAGEREF _Toc201820771 \h </w:instrText>
             </w:r>
             <w:r>
               <w:rPr>
@@ -323,7 +517,7 @@
                 <w:noProof/>
                 <w:webHidden/>
               </w:rPr>
-              <w:t>3</w:t>
+              <w:t>6</w:t>
             </w:r>
             <w:r>
               <w:rPr>
@@ -345,7 +539,7 @@
               <w:noProof/>
             </w:rPr>
           </w:pPr>
-          <w:hyperlink w:anchor="_Toc200722439" w:history="1">
+          <w:hyperlink w:anchor="_Toc201820772" w:history="1">
             <w:r>
               <w:rPr>
                 <w:rStyle w:val="Hyperlink"/>
@@ -373,7 +567,7 @@
                 <w:noProof/>
                 <w:webHidden/>
               </w:rPr>
-              <w:instrText xml:space="preserve"> PAGEREF _Toc200722439 \h </w:instrText>
+              <w:instrText xml:space="preserve"> PAGEREF _Toc201820772 \h </w:instrText>
             </w:r>
             <w:r>
               <w:rPr>
@@ -393,7 +587,7 @@
                 <w:noProof/>
                 <w:webHidden/>
               </w:rPr>
-              <w:t>4</w:t>
+              <w:t>7</w:t>
             </w:r>
             <w:r>
               <w:rPr>
@@ -415,7 +609,7 @@
               <w:noProof/>
             </w:rPr>
           </w:pPr>
-          <w:hyperlink w:anchor="_Toc200722440" w:history="1">
+          <w:hyperlink w:anchor="_Toc201820773" w:history="1">
             <w:r>
               <w:rPr>
                 <w:rStyle w:val="Hyperlink"/>
@@ -443,7 +637,7 @@
                 <w:noProof/>
                 <w:webHidden/>
               </w:rPr>
-              <w:instrText xml:space="preserve"> PAGEREF _Toc200722440 \h </w:instrText>
+              <w:instrText xml:space="preserve"> PAGEREF _Toc201820773 \h </w:instrText>
             </w:r>
             <w:r>
               <w:rPr>
@@ -463,7 +657,7 @@
                 <w:noProof/>
                 <w:webHidden/>
               </w:rPr>
-              <w:t>4</w:t>
+              <w:t>7</w:t>
             </w:r>
             <w:r>
               <w:rPr>
@@ -485,7 +679,7 @@
               <w:noProof/>
             </w:rPr>
           </w:pPr>
-          <w:hyperlink w:anchor="_Toc200722441" w:history="1">
+          <w:hyperlink w:anchor="_Toc201820774" w:history="1">
             <w:r>
               <w:rPr>
                 <w:rStyle w:val="Hyperlink"/>
@@ -513,7 +707,7 @@
                 <w:noProof/>
                 <w:webHidden/>
               </w:rPr>
-              <w:instrText xml:space="preserve"> PAGEREF _Toc200722441 \h </w:instrText>
+              <w:instrText xml:space="preserve"> PAGEREF _Toc201820774 \h </w:instrText>
             </w:r>
             <w:r>
               <w:rPr>
@@ -533,7 +727,7 @@
                 <w:noProof/>
                 <w:webHidden/>
               </w:rPr>
-              <w:t>5</w:t>
+              <w:t>8</w:t>
             </w:r>
             <w:r>
               <w:rPr>
@@ -555,7 +749,7 @@
               <w:noProof/>
             </w:rPr>
           </w:pPr>
-          <w:hyperlink w:anchor="_Toc200722442" w:history="1">
+          <w:hyperlink w:anchor="_Toc201820775" w:history="1">
             <w:r>
               <w:rPr>
                 <w:rStyle w:val="Hyperlink"/>
@@ -583,7 +777,7 @@
                 <w:noProof/>
                 <w:webHidden/>
               </w:rPr>
-              <w:instrText xml:space="preserve"> PAGEREF _Toc200722442 \h </w:instrText>
+              <w:instrText xml:space="preserve"> PAGEREF _Toc201820775 \h </w:instrText>
             </w:r>
             <w:r>
               <w:rPr>
@@ -603,7 +797,7 @@
                 <w:noProof/>
                 <w:webHidden/>
               </w:rPr>
-              <w:t>6</w:t>
+              <w:t>9</w:t>
             </w:r>
             <w:r>
               <w:rPr>
@@ -625,7 +819,7 @@
               <w:noProof/>
             </w:rPr>
           </w:pPr>
-          <w:hyperlink w:anchor="_Toc200722443" w:history="1">
+          <w:hyperlink w:anchor="_Toc201820776" w:history="1">
             <w:r>
               <w:rPr>
                 <w:rStyle w:val="Hyperlink"/>
@@ -653,7 +847,7 @@
                 <w:noProof/>
                 <w:webHidden/>
               </w:rPr>
-              <w:instrText xml:space="preserve"> PAGEREF _Toc200722443 \h </w:instrText>
+              <w:instrText xml:space="preserve"> PAGEREF _Toc201820776 \h </w:instrText>
             </w:r>
             <w:r>
               <w:rPr>
@@ -673,7 +867,7 @@
                 <w:noProof/>
                 <w:webHidden/>
               </w:rPr>
-              <w:t>6</w:t>
+              <w:t>9</w:t>
             </w:r>
             <w:r>
               <w:rPr>
@@ -695,7 +889,7 @@
               <w:noProof/>
             </w:rPr>
           </w:pPr>
-          <w:hyperlink w:anchor="_Toc200722444" w:history="1">
+          <w:hyperlink w:anchor="_Toc201820777" w:history="1">
             <w:r>
               <w:rPr>
                 <w:rStyle w:val="Hyperlink"/>
@@ -722,7 +916,7 @@
                 <w:noProof/>
                 <w:webHidden/>
               </w:rPr>
-              <w:instrText xml:space="preserve"> PAGEREF _Toc200722444 \h </w:instrText>
+              <w:instrText xml:space="preserve"> PAGEREF _Toc201820777 \h </w:instrText>
             </w:r>
             <w:r>
               <w:rPr>
@@ -742,7 +936,7 @@
                 <w:noProof/>
                 <w:webHidden/>
               </w:rPr>
-              <w:t>7</w:t>
+              <w:t>10</w:t>
             </w:r>
             <w:r>
               <w:rPr>
@@ -764,7 +958,7 @@
               <w:noProof/>
             </w:rPr>
           </w:pPr>
-          <w:hyperlink w:anchor="_Toc200722445" w:history="1">
+          <w:hyperlink w:anchor="_Toc201820778" w:history="1">
             <w:r>
               <w:rPr>
                 <w:rStyle w:val="Hyperlink"/>
@@ -791,7 +985,7 @@
                 <w:noProof/>
                 <w:webHidden/>
               </w:rPr>
-              <w:instrText xml:space="preserve"> PAGEREF _Toc200722445 \h </w:instrText>
+              <w:instrText xml:space="preserve"> PAGEREF _Toc201820778 \h </w:instrText>
             </w:r>
             <w:r>
               <w:rPr>
@@ -811,7 +1005,7 @@
                 <w:noProof/>
                 <w:webHidden/>
               </w:rPr>
-              <w:t>8</w:t>
+              <w:t>11</w:t>
             </w:r>
             <w:r>
               <w:rPr>
@@ -833,7 +1027,7 @@
               <w:noProof/>
             </w:rPr>
           </w:pPr>
-          <w:hyperlink w:anchor="_Toc200722446" w:history="1">
+          <w:hyperlink w:anchor="_Toc201820779" w:history="1">
             <w:r>
               <w:rPr>
                 <w:rStyle w:val="Hyperlink"/>
@@ -861,7 +1055,7 @@
                 <w:noProof/>
                 <w:webHidden/>
               </w:rPr>
-              <w:instrText xml:space="preserve"> PAGEREF _Toc200722446 \h </w:instrText>
+              <w:instrText xml:space="preserve"> PAGEREF _Toc201820779 \h </w:instrText>
             </w:r>
             <w:r>
               <w:rPr>
@@ -881,7 +1075,7 @@
                 <w:noProof/>
                 <w:webHidden/>
               </w:rPr>
-              <w:t>9</w:t>
+              <w:t>12</w:t>
             </w:r>
             <w:r>
               <w:rPr>
@@ -903,7 +1097,7 @@
               <w:noProof/>
             </w:rPr>
           </w:pPr>
-          <w:hyperlink w:anchor="_Toc200722447" w:history="1">
+          <w:hyperlink w:anchor="_Toc201820780" w:history="1">
             <w:r>
               <w:rPr>
                 <w:rStyle w:val="Hyperlink"/>
@@ -931,7 +1125,7 @@
                 <w:noProof/>
                 <w:webHidden/>
               </w:rPr>
-              <w:instrText xml:space="preserve"> PAGEREF _Toc200722447 \h </w:instrText>
+              <w:instrText xml:space="preserve"> PAGEREF _Toc201820780 \h </w:instrText>
             </w:r>
             <w:r>
               <w:rPr>
@@ -951,7 +1145,7 @@
                 <w:noProof/>
                 <w:webHidden/>
               </w:rPr>
-              <w:t>10</w:t>
+              <w:t>13</w:t>
             </w:r>
             <w:r>
               <w:rPr>
@@ -973,7 +1167,7 @@
               <w:noProof/>
             </w:rPr>
           </w:pPr>
-          <w:hyperlink w:anchor="_Toc200722448" w:history="1">
+          <w:hyperlink w:anchor="_Toc201820781" w:history="1">
             <w:r>
               <w:rPr>
                 <w:rStyle w:val="Hyperlink"/>
@@ -1001,7 +1195,7 @@
                 <w:noProof/>
                 <w:webHidden/>
               </w:rPr>
-              <w:instrText xml:space="preserve"> PAGEREF _Toc200722448 \h </w:instrText>
+              <w:instrText xml:space="preserve"> PAGEREF _Toc201820781 \h </w:instrText>
             </w:r>
             <w:r>
               <w:rPr>
@@ -1021,7 +1215,7 @@
                 <w:noProof/>
                 <w:webHidden/>
               </w:rPr>
-              <w:t>11</w:t>
+              <w:t>14</w:t>
             </w:r>
             <w:r>
               <w:rPr>
@@ -1055,6 +1249,7 @@
         </w:rPr>
       </w:pPr>
       <w:r>
+        <w:lastRenderedPageBreak/>
         <w:br w:type="page"/>
       </w:r>
     </w:p>
@@ -1065,7 +1260,187 @@
           <w:lang w:val="fr-FR"/>
         </w:rPr>
       </w:pPr>
-      <w:bookmarkStart w:id="0" w:name="_Toc200722436"/>
+      <w:bookmarkStart w:id="0" w:name="_Toc201820767"/>
+      <w:r>
+        <w:rPr>
+          <w:lang w:val="fr-FR"/>
+        </w:rPr>
+        <w:lastRenderedPageBreak/>
+        <w:t>Importation d’un projet dans le Workspace et premier commit</w:t>
+      </w:r>
+      <w:r>
+        <w:rPr>
+          <w:lang w:val="fr-FR"/>
+        </w:rPr>
+        <w:t xml:space="preserve"> vers le dépôt local</w:t>
+      </w:r>
+      <w:bookmarkEnd w:id="0"/>
+    </w:p>
+    <w:p>
+      <w:pPr>
+        <w:rPr>
+          <w:lang w:val="fr-FR"/>
+        </w:rPr>
+      </w:pPr>
+    </w:p>
+    <w:p>
+      <w:pPr>
+        <w:rPr>
+          <w:rFonts w:asciiTheme="majorHAnsi" w:eastAsiaTheme="majorEastAsia" w:hAnsiTheme="majorHAnsi" w:cstheme="majorBidi"/>
+          <w:color w:val="0F4761" w:themeColor="accent1" w:themeShade="BF"/>
+          <w:sz w:val="40"/>
+          <w:szCs w:val="40"/>
+          <w:lang w:val="fr-FR"/>
+        </w:rPr>
+      </w:pPr>
+      <w:r>
+        <w:rPr>
+          <w:rFonts w:asciiTheme="majorHAnsi" w:eastAsiaTheme="majorEastAsia" w:hAnsiTheme="majorHAnsi" w:cstheme="majorBidi"/>
+          <w:noProof/>
+          <w:color w:val="0F4761" w:themeColor="accent1" w:themeShade="BF"/>
+          <w:sz w:val="40"/>
+          <w:szCs w:val="40"/>
+          <w:lang w:val="fr-FR"/>
+        </w:rPr>
+        <w:drawing>
+          <wp:inline distT="0" distB="0" distL="0" distR="0" wp14:anchorId="43B36B8D" wp14:editId="75115C67">
+            <wp:extent cx="4965027" cy="6553200"/>
+            <wp:effectExtent l="0" t="0" r="7620" b="0"/>
+            <wp:docPr id="547624707" name="Picture 1" descr="A screenshot of a computer&#10;&#10;AI-generated content may be incorrect."/>
+            <wp:cNvGraphicFramePr>
+              <a:graphicFrameLocks xmlns:a="http://schemas.openxmlformats.org/drawingml/2006/main" noChangeAspect="1"/>
+            </wp:cNvGraphicFramePr>
+            <a:graphic xmlns:a="http://schemas.openxmlformats.org/drawingml/2006/main">
+              <a:graphicData uri="http://schemas.openxmlformats.org/drawingml/2006/picture">
+                <pic:pic xmlns:pic="http://schemas.openxmlformats.org/drawingml/2006/picture">
+                  <pic:nvPicPr>
+                    <pic:cNvPr id="547624707" name="Picture 1" descr="A screenshot of a computer&#10;&#10;AI-generated content may be incorrect."/>
+                    <pic:cNvPicPr/>
+                  </pic:nvPicPr>
+                  <pic:blipFill>
+                    <a:blip r:embed="rId8"/>
+                    <a:stretch>
+                      <a:fillRect/>
+                    </a:stretch>
+                  </pic:blipFill>
+                  <pic:spPr>
+                    <a:xfrm>
+                      <a:off x="0" y="0"/>
+                      <a:ext cx="5037309" cy="6648603"/>
+                    </a:xfrm>
+                    <a:prstGeom prst="rect">
+                      <a:avLst/>
+                    </a:prstGeom>
+                  </pic:spPr>
+                </pic:pic>
+              </a:graphicData>
+            </a:graphic>
+          </wp:inline>
+        </w:drawing>
+      </w:r>
+    </w:p>
+    <w:p>
+      <w:pPr>
+        <w:rPr>
+          <w:rFonts w:asciiTheme="majorHAnsi" w:eastAsiaTheme="majorEastAsia" w:hAnsiTheme="majorHAnsi" w:cstheme="majorBidi"/>
+          <w:color w:val="0F4761" w:themeColor="accent1" w:themeShade="BF"/>
+          <w:sz w:val="40"/>
+          <w:szCs w:val="40"/>
+          <w:lang w:val="fr-FR"/>
+        </w:rPr>
+      </w:pPr>
+      <w:r>
+        <w:rPr>
+          <w:rFonts w:asciiTheme="majorHAnsi" w:eastAsiaTheme="majorEastAsia" w:hAnsiTheme="majorHAnsi" w:cstheme="majorBidi"/>
+          <w:color w:val="0F4761" w:themeColor="accent1" w:themeShade="BF"/>
+          <w:sz w:val="40"/>
+          <w:szCs w:val="40"/>
+          <w:lang w:val="fr-FR"/>
+        </w:rPr>
+        <w:br w:type="page"/>
+      </w:r>
+    </w:p>
+    <w:p>
+      <w:pPr>
+        <w:pStyle w:val="Heading1"/>
+        <w:rPr>
+          <w:lang w:val="fr-FR"/>
+        </w:rPr>
+      </w:pPr>
+      <w:bookmarkStart w:id="1" w:name="_Toc201820768"/>
+      <w:r>
+        <w:rPr>
+          <w:lang w:val="fr-FR"/>
+        </w:rPr>
+        <w:lastRenderedPageBreak/>
+        <w:t>Lien vers le dépôt distant et premier push</w:t>
+      </w:r>
+      <w:bookmarkEnd w:id="1"/>
+    </w:p>
+    <w:p>
+      <w:pPr>
+        <w:rPr>
+          <w:rFonts w:asciiTheme="majorHAnsi" w:eastAsiaTheme="majorEastAsia" w:hAnsiTheme="majorHAnsi" w:cstheme="majorBidi"/>
+          <w:color w:val="0F4761" w:themeColor="accent1" w:themeShade="BF"/>
+          <w:sz w:val="40"/>
+          <w:szCs w:val="40"/>
+          <w:lang w:val="fr-FR"/>
+        </w:rPr>
+      </w:pPr>
+      <w:r>
+        <w:rPr>
+          <w:rFonts w:asciiTheme="majorHAnsi" w:eastAsiaTheme="majorEastAsia" w:hAnsiTheme="majorHAnsi" w:cstheme="majorBidi"/>
+          <w:noProof/>
+          <w:color w:val="0F4761" w:themeColor="accent1" w:themeShade="BF"/>
+          <w:sz w:val="40"/>
+          <w:szCs w:val="40"/>
+          <w:lang w:val="fr-FR"/>
+        </w:rPr>
+        <w:drawing>
+          <wp:inline distT="0" distB="0" distL="0" distR="0" wp14:anchorId="614FE26E" wp14:editId="60A2AC6C">
+            <wp:extent cx="6471585" cy="7627620"/>
+            <wp:effectExtent l="0" t="0" r="5715" b="0"/>
+            <wp:docPr id="140117994" name="Picture 1" descr="A screenshot of a computer&#10;&#10;AI-generated content may be incorrect."/>
+            <wp:cNvGraphicFramePr>
+              <a:graphicFrameLocks xmlns:a="http://schemas.openxmlformats.org/drawingml/2006/main" noChangeAspect="1"/>
+            </wp:cNvGraphicFramePr>
+            <a:graphic xmlns:a="http://schemas.openxmlformats.org/drawingml/2006/main">
+              <a:graphicData uri="http://schemas.openxmlformats.org/drawingml/2006/picture">
+                <pic:pic xmlns:pic="http://schemas.openxmlformats.org/drawingml/2006/picture">
+                  <pic:nvPicPr>
+                    <pic:cNvPr id="140117994" name="Picture 1" descr="A screenshot of a computer&#10;&#10;AI-generated content may be incorrect."/>
+                    <pic:cNvPicPr/>
+                  </pic:nvPicPr>
+                  <pic:blipFill>
+                    <a:blip r:embed="rId9"/>
+                    <a:stretch>
+                      <a:fillRect/>
+                    </a:stretch>
+                  </pic:blipFill>
+                  <pic:spPr>
+                    <a:xfrm>
+                      <a:off x="0" y="0"/>
+                      <a:ext cx="6494243" cy="7654326"/>
+                    </a:xfrm>
+                    <a:prstGeom prst="rect">
+                      <a:avLst/>
+                    </a:prstGeom>
+                  </pic:spPr>
+                </pic:pic>
+              </a:graphicData>
+            </a:graphic>
+          </wp:inline>
+        </w:drawing>
+      </w:r>
+    </w:p>
+    <w:p>
+      <w:pPr>
+        <w:pStyle w:val="Heading1"/>
+        <w:rPr>
+          <w:lang w:val="fr-FR"/>
+        </w:rPr>
+      </w:pPr>
+      <w:bookmarkStart w:id="2" w:name="_Toc201820769"/>
       <w:r>
         <w:rPr>
           <w:lang w:val="fr-FR"/>
@@ -1073,7 +1448,7 @@
         <w:lastRenderedPageBreak/>
         <w:t>Les branches</w:t>
       </w:r>
-      <w:bookmarkEnd w:id="0"/>
+      <w:bookmarkEnd w:id="2"/>
     </w:p>
     <w:p>
       <w:pPr>
@@ -1082,13 +1457,13 @@
           <w:lang w:val="fr-FR"/>
         </w:rPr>
       </w:pPr>
-      <w:bookmarkStart w:id="1" w:name="_Toc200722437"/>
+      <w:bookmarkStart w:id="3" w:name="_Toc201820770"/>
       <w:r>
         <w:rPr>
           <w:noProof/>
         </w:rPr>
         <w:drawing>
-          <wp:anchor distT="0" distB="0" distL="114300" distR="114300" simplePos="0" relativeHeight="251660288" behindDoc="1" locked="0" layoutInCell="1" allowOverlap="1" wp14:anchorId="5A89EEBC" wp14:editId="7665EC22">
+          <wp:anchor distT="0" distB="0" distL="114300" distR="114300" simplePos="0" relativeHeight="251660288" behindDoc="1" locked="0" layoutInCell="1" allowOverlap="1" wp14:anchorId="5A89EEBC" wp14:editId="5B35D297">
             <wp:simplePos x="0" y="0"/>
             <wp:positionH relativeFrom="margin">
               <wp:align>left</wp:align>
@@ -1111,7 +1486,7 @@
                     <pic:cNvPicPr/>
                   </pic:nvPicPr>
                   <pic:blipFill>
-                    <a:blip r:embed="rId7" cstate="print">
+                    <a:blip r:embed="rId10" cstate="print">
                       <a:extLst>
                         <a:ext uri="{28A0092B-C50C-407E-A947-70E740481C1C}">
                           <a14:useLocalDpi xmlns:a14="http://schemas.microsoft.com/office/drawing/2010/main" val="0"/>
@@ -1155,7 +1530,7 @@
         </w:rPr>
         <w:t>branche</w:t>
       </w:r>
-      <w:bookmarkEnd w:id="1"/>
+      <w:bookmarkEnd w:id="3"/>
     </w:p>
     <w:p>
       <w:pPr>
@@ -1171,7 +1546,7 @@
         </w:rPr>
         <w:br w:type="page"/>
       </w:r>
-      <w:bookmarkStart w:id="2" w:name="_Toc200722438"/>
+      <w:bookmarkStart w:id="4" w:name="_Toc201820771"/>
       <w:proofErr w:type="spellStart"/>
       <w:r>
         <w:rPr>
@@ -1187,7 +1562,7 @@
         </w:rPr>
         <w:t xml:space="preserve"> vers une branche</w:t>
       </w:r>
-      <w:bookmarkEnd w:id="2"/>
+      <w:bookmarkEnd w:id="4"/>
       <w:r>
         <w:rPr>
           <w:noProof/>
@@ -1224,7 +1599,7 @@
                     <pic:cNvPicPr/>
                   </pic:nvPicPr>
                   <pic:blipFill>
-                    <a:blip r:embed="rId8"/>
+                    <a:blip r:embed="rId11"/>
                     <a:stretch>
                       <a:fillRect/>
                     </a:stretch>
@@ -1268,7 +1643,7 @@
           <w:lang w:val="fr-FR"/>
         </w:rPr>
       </w:pPr>
-      <w:bookmarkStart w:id="3" w:name="_Toc200722439"/>
+      <w:bookmarkStart w:id="5" w:name="_Toc201820772"/>
       <w:r>
         <w:rPr>
           <w:rStyle w:val="Heading2Char"/>
@@ -1289,7 +1664,7 @@
         </w:rPr>
         <w:t>commits</w:t>
       </w:r>
-      <w:bookmarkEnd w:id="3"/>
+      <w:bookmarkEnd w:id="5"/>
       <w:proofErr w:type="spellEnd"/>
     </w:p>
     <w:p>
@@ -1299,7 +1674,7 @@
           <w:lang w:val="fr-FR"/>
         </w:rPr>
       </w:pPr>
-      <w:bookmarkStart w:id="4" w:name="_Toc200722440"/>
+      <w:bookmarkStart w:id="6" w:name="_Toc201820773"/>
       <w:proofErr w:type="spellStart"/>
       <w:r>
         <w:rPr>
@@ -1316,7 +1691,7 @@
         </w:rPr>
         <w:t xml:space="preserve"> vers un commit</w:t>
       </w:r>
-      <w:bookmarkEnd w:id="4"/>
+      <w:bookmarkEnd w:id="6"/>
       <w:r>
         <w:rPr>
           <w:noProof/>
@@ -1364,7 +1739,7 @@
                     <pic:cNvPicPr/>
                   </pic:nvPicPr>
                   <pic:blipFill>
-                    <a:blip r:embed="rId9"/>
+                    <a:blip r:embed="rId12"/>
                     <a:stretch>
                       <a:fillRect/>
                     </a:stretch>
@@ -1392,7 +1767,7 @@
           <w:lang w:val="fr-FR"/>
         </w:rPr>
       </w:pPr>
-      <w:bookmarkStart w:id="5" w:name="_Toc200722441"/>
+      <w:bookmarkStart w:id="7" w:name="_Toc201820774"/>
       <w:r>
         <w:rPr>
           <w:noProof/>
@@ -1422,7 +1797,7 @@
                     <pic:cNvPicPr/>
                   </pic:nvPicPr>
                   <pic:blipFill>
-                    <a:blip r:embed="rId10">
+                    <a:blip r:embed="rId13">
                       <a:extLst>
                         <a:ext uri="{28A0092B-C50C-407E-A947-70E740481C1C}">
                           <a14:useLocalDpi xmlns:a14="http://schemas.microsoft.com/office/drawing/2010/main" val="0"/>
@@ -1468,7 +1843,7 @@
         </w:rPr>
         <w:t xml:space="preserve"> vers le dernier commit</w:t>
       </w:r>
-      <w:bookmarkEnd w:id="5"/>
+      <w:bookmarkEnd w:id="7"/>
     </w:p>
     <w:p>
       <w:pPr>
@@ -1490,7 +1865,7 @@
           <w:lang w:val="fr-FR"/>
         </w:rPr>
       </w:pPr>
-      <w:bookmarkStart w:id="6" w:name="_Toc200722442"/>
+      <w:bookmarkStart w:id="8" w:name="_Toc201820775"/>
       <w:r>
         <w:rPr>
           <w:lang w:val="fr-FR"/>
@@ -1498,7 +1873,7 @@
         <w:lastRenderedPageBreak/>
         <w:t>Les merges</w:t>
       </w:r>
-      <w:bookmarkEnd w:id="6"/>
+      <w:bookmarkEnd w:id="8"/>
     </w:p>
     <w:p>
       <w:pPr>
@@ -1507,7 +1882,7 @@
           <w:lang w:val="fr-FR"/>
         </w:rPr>
       </w:pPr>
-      <w:bookmarkStart w:id="7" w:name="_Toc200722443"/>
+      <w:bookmarkStart w:id="9" w:name="_Toc201820776"/>
       <w:r>
         <w:rPr>
           <w:lang w:val="fr-FR"/>
@@ -1544,7 +1919,7 @@
         </w:rPr>
         <w:t xml:space="preserve"> la branche master</w:t>
       </w:r>
-      <w:bookmarkEnd w:id="7"/>
+      <w:bookmarkEnd w:id="9"/>
     </w:p>
     <w:p>
       <w:r>
@@ -1567,7 +1942,7 @@
                     <pic:cNvPicPr/>
                   </pic:nvPicPr>
                   <pic:blipFill>
-                    <a:blip r:embed="rId11"/>
+                    <a:blip r:embed="rId14"/>
                     <a:stretch>
                       <a:fillRect/>
                     </a:stretch>
@@ -1592,12 +1967,12 @@
       <w:pPr>
         <w:pStyle w:val="Heading2"/>
       </w:pPr>
-      <w:bookmarkStart w:id="8" w:name="_Toc200722444"/>
+      <w:bookmarkStart w:id="10" w:name="_Toc201820777"/>
       <w:r>
         <w:lastRenderedPageBreak/>
         <w:t>Abandon d’un merge</w:t>
       </w:r>
-      <w:bookmarkEnd w:id="8"/>
+      <w:bookmarkEnd w:id="10"/>
     </w:p>
     <w:p/>
     <w:p>
@@ -1621,7 +1996,7 @@
                     <pic:cNvPicPr/>
                   </pic:nvPicPr>
                   <pic:blipFill>
-                    <a:blip r:embed="rId12"/>
+                    <a:blip r:embed="rId15"/>
                     <a:stretch>
                       <a:fillRect/>
                     </a:stretch>
@@ -1651,7 +2026,7 @@
       <w:pPr>
         <w:pStyle w:val="Heading2"/>
       </w:pPr>
-      <w:bookmarkStart w:id="9" w:name="_Toc200722445"/>
+      <w:bookmarkStart w:id="11" w:name="_Toc201820778"/>
       <w:proofErr w:type="spellStart"/>
       <w:r>
         <w:lastRenderedPageBreak/>
@@ -1684,7 +2059,7 @@
       <w:r>
         <w:t>conflit</w:t>
       </w:r>
-      <w:bookmarkEnd w:id="9"/>
+      <w:bookmarkEnd w:id="11"/>
       <w:proofErr w:type="spellEnd"/>
     </w:p>
     <w:p/>
@@ -1709,7 +2084,7 @@
                     <pic:cNvPicPr/>
                   </pic:nvPicPr>
                   <pic:blipFill>
-                    <a:blip r:embed="rId13"/>
+                    <a:blip r:embed="rId16"/>
                     <a:stretch>
                       <a:fillRect/>
                     </a:stretch>
@@ -1742,7 +2117,7 @@
           <w:lang w:val="fr-FR"/>
         </w:rPr>
       </w:pPr>
-      <w:bookmarkStart w:id="10" w:name="_Toc200722446"/>
+      <w:bookmarkStart w:id="12" w:name="_Toc201820779"/>
       <w:r>
         <w:rPr>
           <w:lang w:val="fr-FR"/>
@@ -1756,7 +2131,7 @@
         </w:rPr>
         <w:t>e conflit</w:t>
       </w:r>
-      <w:bookmarkEnd w:id="10"/>
+      <w:bookmarkEnd w:id="12"/>
     </w:p>
     <w:p>
       <w:pPr>
@@ -1792,7 +2167,7 @@
                     <pic:cNvPicPr/>
                   </pic:nvPicPr>
                   <pic:blipFill>
-                    <a:blip r:embed="rId14"/>
+                    <a:blip r:embed="rId17"/>
                     <a:stretch>
                       <a:fillRect/>
                     </a:stretch>
@@ -1833,7 +2208,7 @@
           <w:lang w:val="fr-FR"/>
         </w:rPr>
       </w:pPr>
-      <w:bookmarkStart w:id="11" w:name="_Toc200722447"/>
+      <w:bookmarkStart w:id="13" w:name="_Toc201820780"/>
       <w:r>
         <w:rPr>
           <w:lang w:val="fr-FR"/>
@@ -1859,7 +2234,7 @@
         </w:rPr>
         <w:t xml:space="preserve"> conflit</w:t>
       </w:r>
-      <w:bookmarkEnd w:id="11"/>
+      <w:bookmarkEnd w:id="13"/>
     </w:p>
     <w:p>
       <w:pPr>
@@ -1876,6 +2251,7 @@
       </w:pPr>
       <w:r>
         <w:rPr>
+          <w:noProof/>
           <w:lang w:val="fr-FR"/>
         </w:rPr>
         <w:drawing>
@@ -1894,7 +2270,7 @@
                     <pic:cNvPicPr/>
                   </pic:nvPicPr>
                   <pic:blipFill>
-                    <a:blip r:embed="rId15"/>
+                    <a:blip r:embed="rId18"/>
                     <a:stretch>
                       <a:fillRect/>
                     </a:stretch>
@@ -1922,7 +2298,7 @@
           <w:lang w:val="fr-FR"/>
         </w:rPr>
       </w:pPr>
-      <w:bookmarkStart w:id="12" w:name="_Toc200722448"/>
+      <w:bookmarkStart w:id="14" w:name="_Toc201820781"/>
       <w:r>
         <w:rPr>
           <w:lang w:val="fr-FR"/>
@@ -1930,7 +2306,7 @@
         <w:lastRenderedPageBreak/>
         <w:t>Vue des changements en attente</w:t>
       </w:r>
-      <w:bookmarkEnd w:id="12"/>
+      <w:bookmarkEnd w:id="14"/>
     </w:p>
     <w:p>
       <w:pPr>
@@ -1947,6 +2323,7 @@
       </w:pPr>
       <w:r>
         <w:rPr>
+          <w:noProof/>
           <w:lang w:val="fr-FR"/>
         </w:rPr>
         <w:drawing>
@@ -1965,7 +2342,7 @@
                     <pic:cNvPicPr/>
                   </pic:nvPicPr>
                   <pic:blipFill>
-                    <a:blip r:embed="rId16"/>
+                    <a:blip r:embed="rId19"/>
                     <a:stretch>
                       <a:fillRect/>
                     </a:stretch>
@@ -1987,8 +2364,8 @@
       </w:r>
     </w:p>
     <w:sectPr>
-      <w:headerReference w:type="default" r:id="rId17"/>
-      <w:footerReference w:type="default" r:id="rId18"/>
+      <w:headerReference w:type="default" r:id="rId20"/>
+      <w:footerReference w:type="default" r:id="rId21"/>
       <w:pgSz w:w="12240" w:h="15840"/>
       <w:pgMar w:top="1440" w:right="1440" w:bottom="1440" w:left="1440" w:header="708" w:footer="708" w:gutter="0"/>
       <w:cols w:space="708"/>

</xml_diff>